<commit_message>
fix: abbreviation consistency in summary_zh (EIA/SDN/CMI/EU ETS/MoE/SMIC inline expansion)
</commit_message>
<xml_diff>
--- a/reports/topics_overview/2026-04/地缘政治追踪-国际地缘政治动态（20260401-20260408）.docx
+++ b/reports/topics_overview/2026-04/地缘政治追踪-国际地缘政治动态（20260401-20260408）.docx
@@ -64,7 +64,7 @@
         <w:pStyle w:val="19"/>
       </w:pPr>
       <w:r>
-        <w:t>OFAC在四月第一周对SDN名单进行两次调整，分别移除委内瑞拉和俄罗斯相关制裁对象。4月1日，委内瑞拉执行副总统德尔西·罗德里格斯·戈麦斯被从特别指定国民名单中删除，此举与特朗普政府拘押马杜罗、对委石油封锁等系列强硬行动并行。4月3日，俄罗斯国民米哈伊尔·扎多尔诺夫被移除SDN名单。两次调整均未附公开说明，行政性名单更新是否反映更广泛的制裁政策方向调整有待后续观察。</w:t>
+        <w:t>OFAC在四月第一周对特别指定国民名单（SDN）进行两次调整，分别移除委内瑞拉和俄罗斯相关制裁对象。4月1日，委内瑞拉执行副总统德尔西·罗德里格斯·戈麦斯被从SDN名单中删除，此举与特朗普政府拘押马杜罗、对委石油封锁等系列强硬行动并行。4月3日，俄罗斯国民米哈伊尔·扎多尔诺夫被移除SDN名单。两次调整均未附公开说明，行政性名单更新是否反映更广泛的制裁政策方向调整有待后续观察。</w:t>
       </w:r>
     </w:p>
     <w:p>
@@ -144,7 +144,7 @@
         <w:pStyle w:val="19"/>
       </w:pPr>
       <w:r>
-        <w:t>欧盟委员会公布CBAM运营阶段首个季度证书价格，每吨CO₂定价75.36欧元。价格基于EU ETS排放配额拍卖加权均价计算，确保欧洲生产商与进口商面对等价碳成本，防止碳泄漏。2026年按季度公布价格（4月7日、7月6日、10月5日、1月4日），2027年起改为每周公布，标志机制进一步成熟。进口商需在2027年2月开始购买证书以覆盖2026年进口商品的碳排放，交易通过统一中央平台处理。</w:t>
+        <w:t>欧盟委员会公布CBAM运营阶段首个季度证书价格，每吨CO₂定价75.36欧元。价格基于EU ETS（欧盟排放交易体系）排放配额拍卖加权均价计算，确保欧洲生产商与进口商面对等价碳成本，防止碳泄漏。2026年按季度公布价格（4月7日、7月6日、10月5日、1月4日），2027年起改为每周公布，标志机制进一步成熟。进口商需在2027年2月开始购买证书以覆盖2026年进口商品的碳排放，交易通过统一中央平台处理。</w:t>
       </w:r>
     </w:p>
     <w:p>
@@ -224,7 +224,7 @@
         <w:pStyle w:val="19"/>
       </w:pPr>
       <w:r>
-        <w:t>关键矿产研究所更新2026年观察名单，以供应集中度而非地质稀缺性重新排列矿种优先级。新增铼（Re）和铟（In），分别因航空航天与半导体领域的战略用途纳入名单。钨（W）因在国防、工业刀具和先进制造中的关键作用升入前五，全球供应高度集中且西方产能有限。钴（Co）从前五降级，尽管全球约70%产量仍集中在刚果（金），但供应本身的战略紧迫性弱于新入选矿种。CMI定义关键矿产的核心标准为供应集中度风险，而非地质稀缺性——一国或两国垄断生产且存在可靠性风险时即构成关键性。</w:t>
+        <w:t>关键矿产研究所（CMI）更新2026年观察名单，以供应集中度而非地质稀缺性重新排列矿种优先级。新增铼（Re）和铟（In），分别因航空航天与半导体领域的战略用途纳入名单。钨（W）因在国防、工业刀具和先进制造中的关键作用升入前五，全球供应高度集中且西方产能有限。钴（Co）从前五降级，尽管全球约70%产量仍集中在刚果（金），但供应本身的战略紧迫性弱于新入选矿种。CMI定义关键矿产的核心标准为供应集中度风险，而非地质稀缺性——一国或两国垄断生产且存在可靠性风险时即构成关键性。</w:t>
       </w:r>
     </w:p>
     <w:p>
@@ -248,7 +248,7 @@
         <w:pStyle w:val="19"/>
       </w:pPr>
       <w:r>
-        <w:t>美国能源信息署发布短期能源展望更新，将霍尔木兹海峡关闭列为预测核心变量。美国EIA指出霍尔木兹海峡关闭和相关生产中断是最新短期能源预测的关键驱动因素。4月8日EIA同步发布《2026年度能源展望》，系统性评估中东冲突对全球油气供应的中长期影响。EIA为美国能源部下属统计机构，其预测被全球能源市场和各国政府广泛参考</w:t>
+        <w:t>美国能源信息署（EIA）发布短期能源展望更新，将霍尔木兹海峡关闭列为预测核心变量。EIA指出霍尔木兹海峡关闭和相关生产中断是最新短期能源预测的关键驱动因素。4月8日EIA同步发布《2026年度能源展望》，系统性评估中东冲突对全球油气供应的中长期影响</w:t>
       </w:r>
     </w:p>
     <w:p>
@@ -352,7 +352,7 @@
         <w:pStyle w:val="19"/>
       </w:pPr>
       <w:r>
-        <w:t>中国AI模型DeepSeek V4选择华为昇腾处理器为硬件底座，加速中国AI生态去NVIDIA化。DeepSeek V4采用MoE架构，总参数量达万亿级别，单次推理激活约370亿参数，规模较V3翻倍以上。V4原本可更早发布，但过去数月为适配华为和寒武纪芯片进行大量底层架构重写，刻意脱离NVIDIA CUDA生态。阿里巴巴、字节跳动、腾讯等头部企业据报已向华为下达数十万颗芯片订单，推动华为芯片价格上涨约20%。硬件方面，华为昇腾950 PR基于SMIC 7nm工艺和达芬奇架构，提供1 PFLOPS（FP8）算力、2 TB/s互联带宽，集成自研HiBL内存112GB以减少外部供应链依赖。</w:t>
+        <w:t>中国AI模型DeepSeek V4选择华为昇腾处理器为硬件底座，加速中国AI生态去NVIDIA化。DeepSeek V4采用MoE（混合专家）架构，总参数量达万亿级别，单次推理激活约370亿参数，规模较V3翻倍以上。V4原本可更早发布，但过去数月为适配华为和寒武纪芯片进行大量底层架构重写，刻意脱离NVIDIA CUDA生态。阿里巴巴、字节跳动、腾讯等头部企业据报已向华为下达数十万颗芯片订单，推动华为芯片价格上涨约20%。硬件方面，华为昇腾950 PR基于中芯国际（SMIC）7nm工艺和达芬奇架构，提供1 PFLOPS（FP8）算力、2 TB/s互联带宽，集成自研HiBL内存112GB以减少外部供应链依赖。</w:t>
       </w:r>
     </w:p>
     <w:p>

</xml_diff>

<commit_message>
fix: remove sequential numbering from docx event headings
</commit_message>
<xml_diff>
--- a/reports/topics_overview/2026-04/地缘政治追踪-国际地缘政治动态（20260401-20260408）.docx
+++ b/reports/topics_overview/2026-04/地缘政治追踪-国际地缘政治动态（20260401-20260408）.docx
@@ -56,7 +56,7 @@
         <w:pStyle w:val="4"/>
       </w:pPr>
       <w:r>
-        <w:t>（1）04-01|美国|OFAC连续调整SDN名单：移除委内瑞拉和俄罗斯制裁对象</w:t>
+        <w:t>04-01|美国|OFAC连续调整SDN名单：移除委内瑞拉和俄罗斯制裁对象</w:t>
       </w:r>
     </w:p>
     <w:p>
@@ -88,7 +88,7 @@
         <w:pStyle w:val="4"/>
       </w:pPr>
       <w:r>
-        <w:t>（2）04-02|美国|特朗普签署行政令对专利药品征收最高100%关税</w:t>
+        <w:t>04-02|美国|特朗普签署行政令对专利药品征收最高100%关税</w:t>
       </w:r>
     </w:p>
     <w:p>
@@ -112,7 +112,7 @@
         <w:pStyle w:val="4"/>
       </w:pPr>
       <w:r>
-        <w:t>（3）04-02|美国|特朗普重构Section 232金属关税：成品50%、衍生品15-25%</w:t>
+        <w:t>04-02|美国|特朗普重构Section 232金属关税：成品50%、衍生品15-25%</w:t>
       </w:r>
     </w:p>
     <w:p>
@@ -136,7 +136,7 @@
         <w:pStyle w:val="4"/>
       </w:pPr>
       <w:r>
-        <w:t>（4）04-07|欧盟|欧盟公布首个CBAM碳边境调节机制证书价格：75.36欧元/吨</w:t>
+        <w:t>04-07|欧盟|欧盟公布首个CBAM碳边境调节机制证书价格：75.36欧元/吨</w:t>
       </w:r>
     </w:p>
     <w:p>
@@ -168,7 +168,7 @@
         <w:pStyle w:val="4"/>
       </w:pPr>
       <w:r>
-        <w:t>（5）04-01|欧盟|欧洲审计院发布关键原材料特别报告，评估能源转型供应安全</w:t>
+        <w:t>04-01|欧盟|欧洲审计院发布关键原材料特别报告，评估能源转型供应安全</w:t>
       </w:r>
     </w:p>
     <w:p>
@@ -192,7 +192,7 @@
         <w:pStyle w:val="4"/>
       </w:pPr>
       <w:r>
-        <w:t>（6）04-05|多国|OPEC+同意5月增产20.6万桶/日，附霍尔木兹海峡开放条件</w:t>
+        <w:t>04-05|多国|OPEC+同意5月增产20.6万桶/日，附霍尔木兹海峡开放条件</w:t>
       </w:r>
     </w:p>
     <w:p>
@@ -216,7 +216,7 @@
         <w:pStyle w:val="4"/>
       </w:pPr>
       <w:r>
-        <w:t>（7）04-05|国际|CMI发布2026年关键矿产观察名单：钨升至前五，钴降级</w:t>
+        <w:t>04-05|国际|CMI发布2026年关键矿产观察名单：钨升至前五，钴降级</w:t>
       </w:r>
     </w:p>
     <w:p>
@@ -240,7 +240,7 @@
         <w:pStyle w:val="4"/>
       </w:pPr>
       <w:r>
-        <w:t>（8）04-07|美国|美国EIA评估：霍尔木兹关闭是短期能源预测的关键驱动因素</w:t>
+        <w:t>04-07|美国|美国EIA评估：霍尔木兹关闭是短期能源预测的关键驱动因素</w:t>
       </w:r>
     </w:p>
     <w:p>
@@ -264,7 +264,7 @@
         <w:pStyle w:val="4"/>
       </w:pPr>
       <w:r>
-        <w:t>（9）04-02|中国|中国外交部就霍尔木兹海峡危机连续表态</w:t>
+        <w:t>04-02|中国|中国外交部就霍尔木兹海峡危机连续表态</w:t>
       </w:r>
     </w:p>
     <w:p>
@@ -296,7 +296,7 @@
         <w:pStyle w:val="4"/>
       </w:pPr>
       <w:r>
-        <w:t>（10）04-01|美国|商务部修订对华/澳门先进计算商品出口许可审查政策</w:t>
+        <w:t>04-01|美国|商务部修订对华/澳门先进计算商品出口许可审查政策</w:t>
       </w:r>
     </w:p>
     <w:p>
@@ -320,7 +320,7 @@
         <w:pStyle w:val="4"/>
       </w:pPr>
       <w:r>
-        <w:t>（11）04-01|美国|美国安森美宣布在华追加5000万美元投资，上海设大中华区总部</w:t>
+        <w:t>04-01|美国|美国安森美宣布在华追加5000万美元投资，上海设大中华区总部</w:t>
       </w:r>
     </w:p>
     <w:p>
@@ -344,7 +344,7 @@
         <w:pStyle w:val="4"/>
       </w:pPr>
       <w:r>
-        <w:t>（12）04-07|中国|DeepSeek V4部署华为昇腾950 PR，万亿参数模型脱离CUDA</w:t>
+        <w:t>04-07|中国|DeepSeek V4部署华为昇腾950 PR，万亿参数模型脱离CUDA</w:t>
       </w:r>
     </w:p>
     <w:p>

</xml_diff>

<commit_message>
fix: sort events by date within each section in docx
</commit_message>
<xml_diff>
--- a/reports/topics_overview/2026-04/地缘政治追踪-国际地缘政治动态（20260401-20260408）.docx
+++ b/reports/topics_overview/2026-04/地缘政治追踪-国际地缘政治动态（20260401-20260408）.docx
@@ -192,6 +192,30 @@
         <w:pStyle w:val="4"/>
       </w:pPr>
       <w:r>
+        <w:t>04-02|中国|中国外交部就霍尔木兹海峡危机连续表态</w:t>
+      </w:r>
+    </w:p>
+    <w:p>
+      <w:pPr>
+        <w:pStyle w:val="19"/>
+      </w:pPr>
+      <w:r>
+        <w:t>中国外交部在一周内两次就霍尔木兹海峡局势公开表态，将通航受阻定性为美以军事行动后果。4月2日毛宁回应特朗普建议各国"去霍尔木兹海峡抢石油"：通航受阻根源是美国和以色列对伊朗的非法军事行动，只有停火止战才能从根本上维护国际航道安全畅通。4月8日毛宁就伊朗拟对通过海峡的船只收取航运费表态：霍尔木兹海峡是重要能源贸易通道，维护这一地区安全稳定和畅通符合国际社会共同利益。中方将危机根源归咎于美以军事行动，与美方"航行自由"叙事形成明确对照</w:t>
+      </w:r>
+    </w:p>
+    <w:p>
+      <w:pPr>
+        <w:pStyle w:val="19"/>
+      </w:pPr>
+      <w:r>
+        <w:t>资料来源：外交部发言人办公室（环球时报转载4/2表态），https://mp.weixin.qq.com/s/entmuaeNvUxfRYx2bOW5fQ</w:t>
+      </w:r>
+    </w:p>
+    <w:p>
+      <w:pPr>
+        <w:pStyle w:val="4"/>
+      </w:pPr>
+      <w:r>
         <w:t>04-05|多国|OPEC+同意5月增产20.6万桶/日，附霍尔木兹海峡开放条件</w:t>
       </w:r>
     </w:p>
@@ -257,30 +281,6 @@
       </w:pPr>
       <w:r>
         <w:t>资料来源：美国EIA，https://www.eia.gov/pressroom/releases/press586.php</w:t>
-      </w:r>
-    </w:p>
-    <w:p>
-      <w:pPr>
-        <w:pStyle w:val="4"/>
-      </w:pPr>
-      <w:r>
-        <w:t>04-02|中国|中国外交部就霍尔木兹海峡危机连续表态</w:t>
-      </w:r>
-    </w:p>
-    <w:p>
-      <w:pPr>
-        <w:pStyle w:val="19"/>
-      </w:pPr>
-      <w:r>
-        <w:t>中国外交部在一周内两次就霍尔木兹海峡局势公开表态，将通航受阻定性为美以军事行动后果。4月2日毛宁回应特朗普建议各国"去霍尔木兹海峡抢石油"：通航受阻根源是美国和以色列对伊朗的非法军事行动，只有停火止战才能从根本上维护国际航道安全畅通。4月8日毛宁就伊朗拟对通过海峡的船只收取航运费表态：霍尔木兹海峡是重要能源贸易通道，维护这一地区安全稳定和畅通符合国际社会共同利益。中方将危机根源归咎于美以军事行动，与美方"航行自由"叙事形成明确对照</w:t>
-      </w:r>
-    </w:p>
-    <w:p>
-      <w:pPr>
-        <w:pStyle w:val="19"/>
-      </w:pPr>
-      <w:r>
-        <w:t>资料来源：外交部发言人办公室（环球时报转载4/2表态），https://mp.weixin.qq.com/s/entmuaeNvUxfRYx2bOW5fQ</w:t>
       </w:r>
     </w:p>
     <w:p>

</xml_diff>